<commit_message>
Qon olish qo'llanmasi: EDTA ependorf 1 ml, EChT (Panchenkov), filialdan namuna yuborish, juft sinov taklifi
Co-Authored-By: Claude Opus 5.5 <noreply@anthropic.com>
</commit_message>
<xml_diff>
--- a/docs/qollanmalar/qon_olish_qollanma.docx
+++ b/docs/qollanmalar/qon_olish_qollanma.docx
@@ -17,7 +17,7 @@
           <w:color w:val="666666"/>
           <w:sz w:val="20"/>
         </w:rPr>
-        <w:t>Laboratoriya xodimlari uchun · 15.10.2026 · Onlayn nusxa: https://claude.ai/code/artifact/77f527d5-de3b-4947-9e8c-4d8248ec861b</w:t>
+        <w:t>Laboratoriya xodimlari uchun · 15.10.2026 (yangilangan) · Onlayn nusxa: https://claude.ai/code/artifact/77f527d5-de3b-4947-9e8c-4d8248ec861b</w:t>
       </w:r>
     </w:p>
     <w:p>
@@ -249,6 +249,63 @@
                 <w:b/>
                 <w:sz w:val="20"/>
               </w:rPr>
+              <w:t>EChT (SOE)</w:t>
+            </w:r>
+          </w:p>
+        </w:tc>
+        <w:tc>
+          <w:tcPr>
+            <w:tcW w:type="dxa" w:w="3288"/>
+          </w:tcPr>
+          <w:p>
+            <w:pPr>
+              <w:spacing w:after="0"/>
+            </w:pPr>
+            <w:r>
+              <w:rPr>
+                <w:b w:val="0"/>
+                <w:sz w:val="20"/>
+              </w:rPr>
+              <w:t>Panchenkov kapillyari, 5% natriy sitrat (1:4)</w:t>
+            </w:r>
+          </w:p>
+        </w:tc>
+        <w:tc>
+          <w:tcPr>
+            <w:tcW w:type="dxa" w:w="3288"/>
+          </w:tcPr>
+          <w:p>
+            <w:pPr>
+              <w:spacing w:after="0"/>
+            </w:pPr>
+            <w:r>
+              <w:rPr>
+                <w:b w:val="0"/>
+                <w:sz w:val="20"/>
+              </w:rPr>
+              <w:t>Alohida olinadi; 1 soatdan keyin o'qiladi</w:t>
+            </w:r>
+          </w:p>
+        </w:tc>
+      </w:tr>
+      <w:tr>
+        <w:trPr>
+          <w:cantSplit/>
+        </w:trPr>
+        <w:tc>
+          <w:tcPr>
+            <w:tcW w:type="dxa" w:w="3288"/>
+            <w:shd w:val="clear" w:color="auto" w:fill="EEF3F8"/>
+          </w:tcPr>
+          <w:p>
+            <w:pPr>
+              <w:spacing w:after="0"/>
+            </w:pPr>
+            <w:r>
+              <w:rPr>
+                <w:b/>
+                <w:sz w:val="20"/>
+              </w:rPr>
               <w:t>Koagulogramma (PT, Kviku, INR, ACHTV, TT, fibrinogen)</w:t>
             </w:r>
           </w:p>
@@ -256,6 +313,7 @@
         <w:tc>
           <w:tcPr>
             <w:tcW w:type="dxa" w:w="3288"/>
+            <w:shd w:val="clear" w:color="auto" w:fill="EEF3F8"/>
           </w:tcPr>
           <w:p>
             <w:pPr>
@@ -273,6 +331,7 @@
         <w:tc>
           <w:tcPr>
             <w:tcW w:type="dxa" w:w="3288"/>
+            <w:shd w:val="clear" w:color="auto" w:fill="EEF3F8"/>
           </w:tcPr>
           <w:p>
             <w:pPr>
@@ -295,7 +354,6 @@
         <w:tc>
           <w:tcPr>
             <w:tcW w:type="dxa" w:w="3288"/>
-            <w:shd w:val="clear" w:color="auto" w:fill="EEF3F8"/>
           </w:tcPr>
           <w:p>
             <w:pPr>
@@ -313,7 +371,6 @@
         <w:tc>
           <w:tcPr>
             <w:tcW w:type="dxa" w:w="3288"/>
-            <w:shd w:val="clear" w:color="auto" w:fill="EEF3F8"/>
           </w:tcPr>
           <w:p>
             <w:pPr>
@@ -331,7 +388,6 @@
         <w:tc>
           <w:tcPr>
             <w:tcW w:type="dxa" w:w="3288"/>
-            <w:shd w:val="clear" w:color="auto" w:fill="EEF3F8"/>
           </w:tcPr>
           <w:p>
             <w:pPr>
@@ -354,6 +410,7 @@
         <w:tc>
           <w:tcPr>
             <w:tcW w:type="dxa" w:w="3288"/>
+            <w:shd w:val="clear" w:color="auto" w:fill="EEF3F8"/>
           </w:tcPr>
           <w:p>
             <w:pPr>
@@ -365,178 +422,6 @@
                 <w:sz w:val="20"/>
               </w:rPr>
               <w:t>Ishqoriy fosfataza (ALP), amilaza</w:t>
-            </w:r>
-          </w:p>
-        </w:tc>
-        <w:tc>
-          <w:tcPr>
-            <w:tcW w:type="dxa" w:w="3288"/>
-          </w:tcPr>
-          <w:p>
-            <w:pPr>
-              <w:spacing w:after="0"/>
-            </w:pPr>
-            <w:r>
-              <w:rPr>
-                <w:b w:val="0"/>
-                <w:sz w:val="20"/>
-              </w:rPr>
-              <w:t>Sariq yoki qizil</w:t>
-            </w:r>
-          </w:p>
-        </w:tc>
-        <w:tc>
-          <w:tcPr>
-            <w:tcW w:type="dxa" w:w="3288"/>
-          </w:tcPr>
-          <w:p>
-            <w:pPr>
-              <w:spacing w:after="0"/>
-            </w:pPr>
-            <w:r>
-              <w:rPr>
-                <w:b w:val="0"/>
-                <w:sz w:val="20"/>
-              </w:rPr>
-              <w:t>EDTA fermentni pasaytiradi</w:t>
-            </w:r>
-          </w:p>
-        </w:tc>
-      </w:tr>
-      <w:tr>
-        <w:trPr>
-          <w:cantSplit/>
-        </w:trPr>
-        <w:tc>
-          <w:tcPr>
-            <w:tcW w:type="dxa" w:w="3288"/>
-            <w:shd w:val="clear" w:color="auto" w:fill="EEF3F8"/>
-          </w:tcPr>
-          <w:p>
-            <w:pPr>
-              <w:spacing w:after="0"/>
-            </w:pPr>
-            <w:r>
-              <w:rPr>
-                <w:b/>
-                <w:sz w:val="20"/>
-              </w:rPr>
-              <w:t>Glyukoza, mochevina, kreatinin, ALT, AST, bilirubin, umumiy oqsil, xolesterin, triglitserid, siydik kislotasi</w:t>
-            </w:r>
-          </w:p>
-        </w:tc>
-        <w:tc>
-          <w:tcPr>
-            <w:tcW w:type="dxa" w:w="3288"/>
-            <w:shd w:val="clear" w:color="auto" w:fill="EEF3F8"/>
-          </w:tcPr>
-          <w:p>
-            <w:pPr>
-              <w:spacing w:after="0"/>
-            </w:pPr>
-            <w:r>
-              <w:rPr>
-                <w:b w:val="0"/>
-                <w:sz w:val="20"/>
-              </w:rPr>
-              <w:t>Sariq/qizil; umumiy qon bilan birga bo'lsa — o'sha EDTA probirka (6-bo'lim shartlari bilan)</w:t>
-            </w:r>
-          </w:p>
-        </w:tc>
-        <w:tc>
-          <w:tcPr>
-            <w:tcW w:type="dxa" w:w="3288"/>
-            <w:shd w:val="clear" w:color="auto" w:fill="EEF3F8"/>
-          </w:tcPr>
-          <w:p>
-            <w:pPr>
-              <w:spacing w:after="0"/>
-            </w:pPr>
-            <w:r>
-              <w:rPr>
-                <w:b w:val="0"/>
-                <w:sz w:val="20"/>
-              </w:rPr>
-              <w:t>EDTA plazmasidan faqat 6-bo'lim shartlari bajarilsa</w:t>
-            </w:r>
-          </w:p>
-        </w:tc>
-      </w:tr>
-      <w:tr>
-        <w:trPr>
-          <w:cantSplit/>
-        </w:trPr>
-        <w:tc>
-          <w:tcPr>
-            <w:tcW w:type="dxa" w:w="3288"/>
-          </w:tcPr>
-          <w:p>
-            <w:pPr>
-              <w:spacing w:after="0"/>
-            </w:pPr>
-            <w:r>
-              <w:rPr>
-                <w:b/>
-                <w:sz w:val="20"/>
-              </w:rPr>
-              <w:t>Revmoproba (RF, CRP, ASLO)</w:t>
-            </w:r>
-          </w:p>
-        </w:tc>
-        <w:tc>
-          <w:tcPr>
-            <w:tcW w:type="dxa" w:w="3288"/>
-          </w:tcPr>
-          <w:p>
-            <w:pPr>
-              <w:spacing w:after="0"/>
-            </w:pPr>
-            <w:r>
-              <w:rPr>
-                <w:b w:val="0"/>
-                <w:sz w:val="20"/>
-              </w:rPr>
-              <w:t>Sariq yoki qizil</w:t>
-            </w:r>
-          </w:p>
-        </w:tc>
-        <w:tc>
-          <w:tcPr>
-            <w:tcW w:type="dxa" w:w="3288"/>
-          </w:tcPr>
-          <w:p>
-            <w:pPr>
-              <w:spacing w:after="0"/>
-            </w:pPr>
-            <w:r>
-              <w:rPr>
-                <w:b w:val="0"/>
-                <w:sz w:val="20"/>
-              </w:rPr>
-              <w:t>Zardob</w:t>
-            </w:r>
-          </w:p>
-        </w:tc>
-      </w:tr>
-      <w:tr>
-        <w:trPr>
-          <w:cantSplit/>
-        </w:trPr>
-        <w:tc>
-          <w:tcPr>
-            <w:tcW w:type="dxa" w:w="3288"/>
-            <w:shd w:val="clear" w:color="auto" w:fill="EEF3F8"/>
-          </w:tcPr>
-          <w:p>
-            <w:pPr>
-              <w:spacing w:after="0"/>
-            </w:pPr>
-            <w:r>
-              <w:rPr>
-                <w:b/>
-                <w:sz w:val="20"/>
-              </w:rPr>
-              <w:t>IFA: gormonlar, TORCH, gepatit markerlari, vitamin D, troponin va h.k.</w:t>
             </w:r>
           </w:p>
         </w:tc>
@@ -562,6 +447,177 @@
           <w:tcPr>
             <w:tcW w:type="dxa" w:w="3288"/>
             <w:shd w:val="clear" w:color="auto" w:fill="EEF3F8"/>
+          </w:tcPr>
+          <w:p>
+            <w:pPr>
+              <w:spacing w:after="0"/>
+            </w:pPr>
+            <w:r>
+              <w:rPr>
+                <w:b w:val="0"/>
+                <w:sz w:val="20"/>
+              </w:rPr>
+              <w:t>EDTA fermentni pasaytiradi</w:t>
+            </w:r>
+          </w:p>
+        </w:tc>
+      </w:tr>
+      <w:tr>
+        <w:trPr>
+          <w:cantSplit/>
+        </w:trPr>
+        <w:tc>
+          <w:tcPr>
+            <w:tcW w:type="dxa" w:w="3288"/>
+          </w:tcPr>
+          <w:p>
+            <w:pPr>
+              <w:spacing w:after="0"/>
+            </w:pPr>
+            <w:r>
+              <w:rPr>
+                <w:b/>
+                <w:sz w:val="20"/>
+              </w:rPr>
+              <w:t>Glyukoza, mochevina, kreatinin, ALT, AST, bilirubin, umumiy oqsil, xolesterin, triglitserid, siydik kislotasi</w:t>
+            </w:r>
+          </w:p>
+        </w:tc>
+        <w:tc>
+          <w:tcPr>
+            <w:tcW w:type="dxa" w:w="3288"/>
+          </w:tcPr>
+          <w:p>
+            <w:pPr>
+              <w:spacing w:after="0"/>
+            </w:pPr>
+            <w:r>
+              <w:rPr>
+                <w:b w:val="0"/>
+                <w:sz w:val="20"/>
+              </w:rPr>
+              <w:t>Sariq/qizil; umumiy qon bilan birga bo'lsa — o'sha EDTA probirka (6-bo'lim shartlari bilan)</w:t>
+            </w:r>
+          </w:p>
+        </w:tc>
+        <w:tc>
+          <w:tcPr>
+            <w:tcW w:type="dxa" w:w="3288"/>
+          </w:tcPr>
+          <w:p>
+            <w:pPr>
+              <w:spacing w:after="0"/>
+            </w:pPr>
+            <w:r>
+              <w:rPr>
+                <w:b w:val="0"/>
+                <w:sz w:val="20"/>
+              </w:rPr>
+              <w:t>EDTA plazmasidan faqat 6-bo'lim shartlari bajarilsa</w:t>
+            </w:r>
+          </w:p>
+        </w:tc>
+      </w:tr>
+      <w:tr>
+        <w:trPr>
+          <w:cantSplit/>
+        </w:trPr>
+        <w:tc>
+          <w:tcPr>
+            <w:tcW w:type="dxa" w:w="3288"/>
+            <w:shd w:val="clear" w:color="auto" w:fill="EEF3F8"/>
+          </w:tcPr>
+          <w:p>
+            <w:pPr>
+              <w:spacing w:after="0"/>
+            </w:pPr>
+            <w:r>
+              <w:rPr>
+                <w:b/>
+                <w:sz w:val="20"/>
+              </w:rPr>
+              <w:t>Revmoproba (RF, CRP, ASLO)</w:t>
+            </w:r>
+          </w:p>
+        </w:tc>
+        <w:tc>
+          <w:tcPr>
+            <w:tcW w:type="dxa" w:w="3288"/>
+            <w:shd w:val="clear" w:color="auto" w:fill="EEF3F8"/>
+          </w:tcPr>
+          <w:p>
+            <w:pPr>
+              <w:spacing w:after="0"/>
+            </w:pPr>
+            <w:r>
+              <w:rPr>
+                <w:b w:val="0"/>
+                <w:sz w:val="20"/>
+              </w:rPr>
+              <w:t>Sariq yoki qizil</w:t>
+            </w:r>
+          </w:p>
+        </w:tc>
+        <w:tc>
+          <w:tcPr>
+            <w:tcW w:type="dxa" w:w="3288"/>
+            <w:shd w:val="clear" w:color="auto" w:fill="EEF3F8"/>
+          </w:tcPr>
+          <w:p>
+            <w:pPr>
+              <w:spacing w:after="0"/>
+            </w:pPr>
+            <w:r>
+              <w:rPr>
+                <w:b w:val="0"/>
+                <w:sz w:val="20"/>
+              </w:rPr>
+              <w:t>Zardob</w:t>
+            </w:r>
+          </w:p>
+        </w:tc>
+      </w:tr>
+      <w:tr>
+        <w:trPr>
+          <w:cantSplit/>
+        </w:trPr>
+        <w:tc>
+          <w:tcPr>
+            <w:tcW w:type="dxa" w:w="3288"/>
+          </w:tcPr>
+          <w:p>
+            <w:pPr>
+              <w:spacing w:after="0"/>
+            </w:pPr>
+            <w:r>
+              <w:rPr>
+                <w:b/>
+                <w:sz w:val="20"/>
+              </w:rPr>
+              <w:t>IFA: gormonlar, TORCH, gepatit markerlari, vitamin D, troponin va h.k.</w:t>
+            </w:r>
+          </w:p>
+        </w:tc>
+        <w:tc>
+          <w:tcPr>
+            <w:tcW w:type="dxa" w:w="3288"/>
+          </w:tcPr>
+          <w:p>
+            <w:pPr>
+              <w:spacing w:after="0"/>
+            </w:pPr>
+            <w:r>
+              <w:rPr>
+                <w:b w:val="0"/>
+                <w:sz w:val="20"/>
+              </w:rPr>
+              <w:t>Sariq yoki qizil</w:t>
+            </w:r>
+          </w:p>
+        </w:tc>
+        <w:tc>
+          <w:tcPr>
+            <w:tcW w:type="dxa" w:w="3288"/>
           </w:tcPr>
           <w:p>
             <w:pPr>
@@ -641,7 +697,7 @@
         </w:trPr>
         <w:tc>
           <w:tcPr>
-            <w:tcW w:type="dxa" w:w="1305"/>
+            <w:tcW w:type="dxa" w:w="1215"/>
             <w:shd w:val="clear" w:color="auto" w:fill="1A3A5C"/>
           </w:tcPr>
           <w:p>
@@ -660,7 +716,7 @@
         </w:tc>
         <w:tc>
           <w:tcPr>
-            <w:tcW w:type="dxa" w:w="1461"/>
+            <w:tcW w:type="dxa" w:w="2041"/>
             <w:shd w:val="clear" w:color="auto" w:fill="1A3A5C"/>
           </w:tcPr>
           <w:p>
@@ -679,7 +735,7 @@
         </w:tc>
         <w:tc>
           <w:tcPr>
-            <w:tcW w:type="dxa" w:w="731"/>
+            <w:tcW w:type="dxa" w:w="680"/>
             <w:shd w:val="clear" w:color="auto" w:fill="1A3A5C"/>
           </w:tcPr>
           <w:p>
@@ -698,7 +754,7 @@
         </w:tc>
         <w:tc>
           <w:tcPr>
-            <w:tcW w:type="dxa" w:w="3132"/>
+            <w:tcW w:type="dxa" w:w="2916"/>
             <w:shd w:val="clear" w:color="auto" w:fill="1A3A5C"/>
           </w:tcPr>
           <w:p>
@@ -717,7 +773,7 @@
         </w:tc>
         <w:tc>
           <w:tcPr>
-            <w:tcW w:type="dxa" w:w="1409"/>
+            <w:tcW w:type="dxa" w:w="1312"/>
             <w:shd w:val="clear" w:color="auto" w:fill="1A3A5C"/>
           </w:tcPr>
           <w:p>
@@ -736,7 +792,7 @@
         </w:tc>
         <w:tc>
           <w:tcPr>
-            <w:tcW w:type="dxa" w:w="1827"/>
+            <w:tcW w:type="dxa" w:w="1701"/>
             <w:shd w:val="clear" w:color="auto" w:fill="1A3A5C"/>
           </w:tcPr>
           <w:p>
@@ -760,7 +816,7 @@
         </w:trPr>
         <w:tc>
           <w:tcPr>
-            <w:tcW w:type="dxa" w:w="1305"/>
+            <w:tcW w:type="dxa" w:w="1215"/>
           </w:tcPr>
           <w:p>
             <w:pPr>
@@ -777,7 +833,7 @@
         </w:tc>
         <w:tc>
           <w:tcPr>
-            <w:tcW w:type="dxa" w:w="1461"/>
+            <w:tcW w:type="dxa" w:w="2041"/>
           </w:tcPr>
           <w:p>
             <w:pPr>
@@ -794,7 +850,7 @@
         </w:tc>
         <w:tc>
           <w:tcPr>
-            <w:tcW w:type="dxa" w:w="731"/>
+            <w:tcW w:type="dxa" w:w="680"/>
           </w:tcPr>
           <w:p>
             <w:pPr>
@@ -811,7 +867,7 @@
         </w:tc>
         <w:tc>
           <w:tcPr>
-            <w:tcW w:type="dxa" w:w="3132"/>
+            <w:tcW w:type="dxa" w:w="2916"/>
           </w:tcPr>
           <w:p>
             <w:pPr>
@@ -828,7 +884,7 @@
         </w:tc>
         <w:tc>
           <w:tcPr>
-            <w:tcW w:type="dxa" w:w="1409"/>
+            <w:tcW w:type="dxa" w:w="1312"/>
           </w:tcPr>
           <w:p>
             <w:pPr>
@@ -845,7 +901,7 @@
         </w:tc>
         <w:tc>
           <w:tcPr>
-            <w:tcW w:type="dxa" w:w="1827"/>
+            <w:tcW w:type="dxa" w:w="1701"/>
           </w:tcPr>
           <w:p>
             <w:pPr>
@@ -867,7 +923,7 @@
         </w:trPr>
         <w:tc>
           <w:tcPr>
-            <w:tcW w:type="dxa" w:w="1305"/>
+            <w:tcW w:type="dxa" w:w="1215"/>
             <w:shd w:val="clear" w:color="auto" w:fill="EEF3F8"/>
           </w:tcPr>
           <w:p>
@@ -885,7 +941,7 @@
         </w:tc>
         <w:tc>
           <w:tcPr>
-            <w:tcW w:type="dxa" w:w="1461"/>
+            <w:tcW w:type="dxa" w:w="2041"/>
             <w:shd w:val="clear" w:color="auto" w:fill="EEF3F8"/>
           </w:tcPr>
           <w:p>
@@ -903,7 +959,7 @@
         </w:tc>
         <w:tc>
           <w:tcPr>
-            <w:tcW w:type="dxa" w:w="731"/>
+            <w:tcW w:type="dxa" w:w="680"/>
             <w:shd w:val="clear" w:color="auto" w:fill="EEF3F8"/>
           </w:tcPr>
           <w:p>
@@ -921,7 +977,7 @@
         </w:tc>
         <w:tc>
           <w:tcPr>
-            <w:tcW w:type="dxa" w:w="3132"/>
+            <w:tcW w:type="dxa" w:w="2916"/>
             <w:shd w:val="clear" w:color="auto" w:fill="EEF3F8"/>
           </w:tcPr>
           <w:p>
@@ -939,7 +995,7 @@
         </w:tc>
         <w:tc>
           <w:tcPr>
-            <w:tcW w:type="dxa" w:w="1409"/>
+            <w:tcW w:type="dxa" w:w="1312"/>
             <w:shd w:val="clear" w:color="auto" w:fill="EEF3F8"/>
           </w:tcPr>
           <w:p>
@@ -957,7 +1013,7 @@
         </w:tc>
         <w:tc>
           <w:tcPr>
-            <w:tcW w:type="dxa" w:w="1827"/>
+            <w:tcW w:type="dxa" w:w="1701"/>
             <w:shd w:val="clear" w:color="auto" w:fill="EEF3F8"/>
           </w:tcPr>
           <w:p>
@@ -980,7 +1036,7 @@
         </w:trPr>
         <w:tc>
           <w:tcPr>
-            <w:tcW w:type="dxa" w:w="1305"/>
+            <w:tcW w:type="dxa" w:w="1215"/>
           </w:tcPr>
           <w:p>
             <w:pPr>
@@ -997,7 +1053,7 @@
         </w:tc>
         <w:tc>
           <w:tcPr>
-            <w:tcW w:type="dxa" w:w="1461"/>
+            <w:tcW w:type="dxa" w:w="2041"/>
           </w:tcPr>
           <w:p>
             <w:pPr>
@@ -1014,7 +1070,7 @@
         </w:tc>
         <w:tc>
           <w:tcPr>
-            <w:tcW w:type="dxa" w:w="731"/>
+            <w:tcW w:type="dxa" w:w="680"/>
           </w:tcPr>
           <w:p>
             <w:pPr>
@@ -1031,7 +1087,7 @@
         </w:tc>
         <w:tc>
           <w:tcPr>
-            <w:tcW w:type="dxa" w:w="3132"/>
+            <w:tcW w:type="dxa" w:w="2916"/>
           </w:tcPr>
           <w:p>
             <w:pPr>
@@ -1048,7 +1104,7 @@
         </w:tc>
         <w:tc>
           <w:tcPr>
-            <w:tcW w:type="dxa" w:w="1409"/>
+            <w:tcW w:type="dxa" w:w="1312"/>
           </w:tcPr>
           <w:p>
             <w:pPr>
@@ -1065,7 +1121,7 @@
         </w:tc>
         <w:tc>
           <w:tcPr>
-            <w:tcW w:type="dxa" w:w="1827"/>
+            <w:tcW w:type="dxa" w:w="1701"/>
           </w:tcPr>
           <w:p>
             <w:pPr>
@@ -1087,7 +1143,7 @@
         </w:trPr>
         <w:tc>
           <w:tcPr>
-            <w:tcW w:type="dxa" w:w="1305"/>
+            <w:tcW w:type="dxa" w:w="1215"/>
             <w:shd w:val="clear" w:color="auto" w:fill="EEF3F8"/>
           </w:tcPr>
           <w:p>
@@ -1105,7 +1161,7 @@
         </w:tc>
         <w:tc>
           <w:tcPr>
-            <w:tcW w:type="dxa" w:w="1461"/>
+            <w:tcW w:type="dxa" w:w="2041"/>
             <w:shd w:val="clear" w:color="auto" w:fill="EEF3F8"/>
           </w:tcPr>
           <w:p>
@@ -1123,7 +1179,7 @@
         </w:tc>
         <w:tc>
           <w:tcPr>
-            <w:tcW w:type="dxa" w:w="731"/>
+            <w:tcW w:type="dxa" w:w="680"/>
             <w:shd w:val="clear" w:color="auto" w:fill="EEF3F8"/>
           </w:tcPr>
           <w:p>
@@ -1141,7 +1197,7 @@
         </w:tc>
         <w:tc>
           <w:tcPr>
-            <w:tcW w:type="dxa" w:w="3132"/>
+            <w:tcW w:type="dxa" w:w="2916"/>
             <w:shd w:val="clear" w:color="auto" w:fill="EEF3F8"/>
           </w:tcPr>
           <w:p>
@@ -1159,7 +1215,7 @@
         </w:tc>
         <w:tc>
           <w:tcPr>
-            <w:tcW w:type="dxa" w:w="1409"/>
+            <w:tcW w:type="dxa" w:w="1312"/>
             <w:shd w:val="clear" w:color="auto" w:fill="EEF3F8"/>
           </w:tcPr>
           <w:p>
@@ -1177,7 +1233,7 @@
         </w:tc>
         <w:tc>
           <w:tcPr>
-            <w:tcW w:type="dxa" w:w="1827"/>
+            <w:tcW w:type="dxa" w:w="1701"/>
             <w:shd w:val="clear" w:color="auto" w:fill="EEF3F8"/>
           </w:tcPr>
           <w:p>
@@ -1200,7 +1256,7 @@
         </w:trPr>
         <w:tc>
           <w:tcPr>
-            <w:tcW w:type="dxa" w:w="1305"/>
+            <w:tcW w:type="dxa" w:w="1215"/>
           </w:tcPr>
           <w:p>
             <w:pPr>
@@ -1217,7 +1273,7 @@
         </w:tc>
         <w:tc>
           <w:tcPr>
-            <w:tcW w:type="dxa" w:w="1461"/>
+            <w:tcW w:type="dxa" w:w="2041"/>
           </w:tcPr>
           <w:p>
             <w:pPr>
@@ -1228,13 +1284,13 @@
                 <w:b w:val="0"/>
                 <w:sz w:val="20"/>
               </w:rPr>
-              <w:t>EDTA K3 purkalgan</w:t>
+              <w:t>EDTA K3 purkalgan; 1 ml gacha to'ldiriladi</w:t>
             </w:r>
           </w:p>
         </w:tc>
         <w:tc>
           <w:tcPr>
-            <w:tcW w:type="dxa" w:w="731"/>
+            <w:tcW w:type="dxa" w:w="680"/>
           </w:tcPr>
           <w:p>
             <w:pPr>
@@ -1251,7 +1307,7 @@
         </w:tc>
         <w:tc>
           <w:tcPr>
-            <w:tcW w:type="dxa" w:w="3132"/>
+            <w:tcW w:type="dxa" w:w="2916"/>
           </w:tcPr>
           <w:p>
             <w:pPr>
@@ -1262,13 +1318,13 @@
                 <w:b w:val="0"/>
                 <w:sz w:val="20"/>
               </w:rPr>
-              <w:t>Umumiy qon (barmoqdan yoki ko'chirilgan qon)</w:t>
+              <w:t>Umumiy qon; bitta glyukoza yoki ALT (barmoqdan yoki ko'chirilgan qon)</w:t>
             </w:r>
           </w:p>
         </w:tc>
         <w:tc>
           <w:tcPr>
-            <w:tcW w:type="dxa" w:w="1409"/>
+            <w:tcW w:type="dxa" w:w="1312"/>
           </w:tcPr>
           <w:p>
             <w:pPr>
@@ -1285,7 +1341,7 @@
         </w:tc>
         <w:tc>
           <w:tcPr>
-            <w:tcW w:type="dxa" w:w="1827"/>
+            <w:tcW w:type="dxa" w:w="1701"/>
           </w:tcPr>
           <w:p>
             <w:pPr>
@@ -1307,7 +1363,7 @@
         </w:trPr>
         <w:tc>
           <w:tcPr>
-            <w:tcW w:type="dxa" w:w="1305"/>
+            <w:tcW w:type="dxa" w:w="1215"/>
             <w:shd w:val="clear" w:color="auto" w:fill="EEF3F8"/>
           </w:tcPr>
           <w:p>
@@ -1325,7 +1381,7 @@
         </w:tc>
         <w:tc>
           <w:tcPr>
-            <w:tcW w:type="dxa" w:w="1461"/>
+            <w:tcW w:type="dxa" w:w="2041"/>
             <w:shd w:val="clear" w:color="auto" w:fill="EEF3F8"/>
           </w:tcPr>
           <w:p>
@@ -1343,7 +1399,7 @@
         </w:tc>
         <w:tc>
           <w:tcPr>
-            <w:tcW w:type="dxa" w:w="731"/>
+            <w:tcW w:type="dxa" w:w="680"/>
             <w:shd w:val="clear" w:color="auto" w:fill="EEF3F8"/>
           </w:tcPr>
           <w:p>
@@ -1361,7 +1417,7 @@
         </w:tc>
         <w:tc>
           <w:tcPr>
-            <w:tcW w:type="dxa" w:w="3132"/>
+            <w:tcW w:type="dxa" w:w="2916"/>
             <w:shd w:val="clear" w:color="auto" w:fill="EEF3F8"/>
           </w:tcPr>
           <w:p>
@@ -1379,7 +1435,7 @@
         </w:tc>
         <w:tc>
           <w:tcPr>
-            <w:tcW w:type="dxa" w:w="1409"/>
+            <w:tcW w:type="dxa" w:w="1312"/>
             <w:shd w:val="clear" w:color="auto" w:fill="EEF3F8"/>
           </w:tcPr>
           <w:p>
@@ -1397,7 +1453,7 @@
         </w:tc>
         <w:tc>
           <w:tcPr>
-            <w:tcW w:type="dxa" w:w="1827"/>
+            <w:tcW w:type="dxa" w:w="1701"/>
             <w:shd w:val="clear" w:color="auto" w:fill="EEF3F8"/>
           </w:tcPr>
           <w:p>
@@ -1834,7 +1890,7 @@
         <w:rPr>
           <w:b w:val="0"/>
         </w:rPr>
-        <w:t>Barmoqdan olingan qon faqat umumiy qon tahlili uchun; bioximiya, minerallar va koagulogramma barmoqdan olinmaydi.</w:t>
+        <w:t>Barmoqdan olingan qon umumiy qon tahlili va bitta-ikkita bioximiya (glyukoza, ALT) uchun; minerallar va koagulogramma barmoqdan olinmaydi.</w:t>
       </w:r>
     </w:p>
     <w:p>
@@ -1927,7 +1983,19 @@
         <w:rPr>
           <w:b w:val="0"/>
         </w:rPr>
-        <w:t>Ependorfni ishlab chiqaruvchi ko'rsatgan hajmgacha to'ldiring; ortiqcha to'ldirilsa EDTA yetmay, mayda laxtalar paydo bo'ladi.</w:t>
+        <w:t xml:space="preserve">Ependorfni </w:t>
+      </w:r>
+      <w:r>
+        <w:rPr>
+          <w:b/>
+        </w:rPr>
+        <w:t>1 ml</w:t>
+      </w:r>
+      <w:r>
+        <w:rPr>
+          <w:b w:val="0"/>
+        </w:rPr>
+        <w:t xml:space="preserve"> gacha to'ldiring; ortiqcha to'ldirilsa EDTA yetmay, mayda laxtalar paydo bo'ladi.</w:t>
       </w:r>
     </w:p>
     <w:p>
@@ -2006,7 +2074,7 @@
         <w:rPr>
           <w:b w:val="0"/>
         </w:rPr>
-        <w:t>Bitta bemorning qoni bir vaqtda binafsha (EDTA) va sariq (gel) probirkaga olinib, 2–3 soatdan keyin BK-280 da o'lchandi.</w:t>
+        <w:t>Bitta bemorning qoni bir vaqtda binafsha (EDTA) va sariq (gel) probirkaga olinib, 2–3 soatdan keyin BK-280 da o'lchandi. Probirkalar bir vaqtda sentrifugalanmagan; mochevina, kreatinin, oqsil va lipidlar sinalmagan.</w:t>
       </w:r>
     </w:p>
     <w:tbl>
@@ -2595,7 +2663,7 @@
         <w:rPr>
           <w:b w:val="0"/>
         </w:rPr>
-        <w:t>Glyukoza farqining sababi: sentrifugalanmagan qonda hujayralar glyukozani iste'mol qilishda davom etadi. 25% kamayish klinik jihatdan katta: haqiqiy 7.0 mmol/L (qandli diabet chegarasi) 5.3 ga tushib, "norma" bo'lib ko'rinadi.</w:t>
+        <w:t>Glyukoza farqining sababi EDTA emas, sentrifugagacha o'tgan vaqt: probirkalar turli vaqtda sentrifugalangan, sentrifugalanmagan qonda esa hujayralar glyukozani iste'mol qilishda davom etadi. 25% kamayish klinik jihatdan katta: haqiqiy 7.0 mmol/L (qandli diabet chegarasi) 5.3 ga tushib, "norma" bo'lib ko'rinadi.</w:t>
       </w:r>
     </w:p>
     <w:p>
@@ -2693,7 +2761,7 @@
         <w:rPr>
           <w:b w:val="0"/>
         </w:rPr>
-        <w:t>Probirka venadan olingan binafsha 3 ml bo'lsin. Barmoqdan olingan qon bioximiyaga tavsiya etilmaydi: hajmi kam, to'qima suyuqligi va gemoliz bor.</w:t>
+        <w:t>Probirka — binafsha 3 ml yoki EDTA li ependorf (1 ml). Ependorfdan bitta-ikkita tahlil (masalan, glyukoza yoki ALT) qilish mumkin. Qon barmoqdan olingan bo'lsa, barmoq siqilmasin (to'qima suyuqligi suyultiradi) va plazmada gemoliz bo'lmasin.</w:t>
       </w:r>
     </w:p>
     <w:p>
@@ -3618,7 +3686,7 @@
         <w:rPr>
           <w:b w:val="0"/>
         </w:rPr>
-        <w:t>Sariq probirkada gel zardob bilan qon o'rtasida to'siq hosil qiladi. Zardobni probirkada qoldirish mumkin; gelli probirka qayta sentrifugalanmaydi.</w:t>
+        <w:t>Sariq probirkada gel zardob bilan qon o'rtasida to'siq hosil qiladi. Zardobni probirkada qoldirish mumkin; gel to'siq butun bo'lsa, probirka qayta sentrifugalanmaydi.</w:t>
       </w:r>
     </w:p>
     <w:p>
@@ -3723,6 +3791,155 @@
           <w:b w:val="0"/>
         </w:rPr>
         <w:t>Qon to'g'ridan-to'g'ri oddiy ependorfga olinmaydi (2-bo'lim).</w:t>
+      </w:r>
+    </w:p>
+    <w:p>
+      <w:pPr>
+        <w:pStyle w:val="Heading3"/>
+      </w:pPr>
+      <w:r>
+        <w:t>Filialdan namuna yuborish</w:t>
+      </w:r>
+    </w:p>
+    <w:p>
+      <w:r>
+        <w:rPr>
+          <w:b w:val="0"/>
+        </w:rPr>
+        <w:t>Amaldagi tartib: umumiy qon (EDTA) sentrifugalanmay yuboriladi, qolgan tahlillar sentrifugalab yuboriladi; yo'lda aralashib qolsa, kelganda qayta sentrifugalanadi.</w:t>
+      </w:r>
+    </w:p>
+    <w:p>
+      <w:r>
+        <w:rPr>
+          <w:b w:val="0"/>
+        </w:rPr>
+        <w:t>Qayta sentrifuga zardobni tiniqlashtiradi, lekin aralashgan vaqtdagi o'zgarishlarni qaytarmaydi:</w:t>
+      </w:r>
+    </w:p>
+    <w:p>
+      <w:pPr>
+        <w:pStyle w:val="ListBullet"/>
+        <w:spacing w:after="20"/>
+      </w:pPr>
+      <w:r>
+        <w:rPr>
+          <w:b/>
+        </w:rPr>
+        <w:t>Kaliy</w:t>
+      </w:r>
+      <w:r>
+        <w:rPr>
+          <w:b w:val="0"/>
+        </w:rPr>
+        <w:t xml:space="preserve"> hujayradan zardobga chiqadi — soxta yuqori.</w:t>
+      </w:r>
+    </w:p>
+    <w:p>
+      <w:pPr>
+        <w:pStyle w:val="ListBullet"/>
+        <w:spacing w:after="20"/>
+      </w:pPr>
+      <w:r>
+        <w:rPr>
+          <w:b/>
+        </w:rPr>
+        <w:t>Glyukoza</w:t>
+      </w:r>
+      <w:r>
+        <w:rPr>
+          <w:b w:val="0"/>
+        </w:rPr>
+        <w:t xml:space="preserve"> hujayralar tomonidan iste'mol qilinadi — soxta past.</w:t>
+      </w:r>
+    </w:p>
+    <w:p>
+      <w:pPr>
+        <w:pStyle w:val="ListBullet"/>
+        <w:spacing w:after="20"/>
+      </w:pPr>
+      <w:r>
+        <w:rPr>
+          <w:b w:val="0"/>
+        </w:rPr>
+        <w:t xml:space="preserve">Chayqalishdan </w:t>
+      </w:r>
+      <w:r>
+        <w:rPr>
+          <w:b/>
+        </w:rPr>
+        <w:t>gemoliz</w:t>
+      </w:r>
+      <w:r>
+        <w:rPr>
+          <w:b w:val="0"/>
+        </w:rPr>
+        <w:t xml:space="preserve"> — AST, LDH, temir soxta yuqori.</w:t>
+      </w:r>
+    </w:p>
+    <w:p>
+      <w:r>
+        <w:rPr>
+          <w:b w:val="0"/>
+        </w:rPr>
+        <w:t>Shuning uchun:</w:t>
+      </w:r>
+    </w:p>
+    <w:p>
+      <w:pPr>
+        <w:spacing w:after="20"/>
+        <w:ind w:left="510" w:hanging="340"/>
+      </w:pPr>
+      <w:r>
+        <w:t xml:space="preserve">1.  </w:t>
+      </w:r>
+      <w:r>
+        <w:rPr>
+          <w:b/>
+        </w:rPr>
+        <w:t>Qizil probirka va EDTA plazmasi</w:t>
+      </w:r>
+      <w:r>
+        <w:rPr>
+          <w:b w:val="0"/>
+        </w:rPr>
+        <w:t xml:space="preserve"> (gel yo'q) — sentrifugadan keyin zardob/plazmani pipetka bilan oddiy ependorfga (1.5 / 2 ml) ajratib, ependorfni yuboring. Ependorfga Sample ID va "zardob" yoki "EDTA plazma" yoziladi.</w:t>
+      </w:r>
+    </w:p>
+    <w:p>
+      <w:pPr>
+        <w:spacing w:after="20"/>
+        <w:ind w:left="510" w:hanging="340"/>
+      </w:pPr>
+      <w:r>
+        <w:t xml:space="preserve">2.  </w:t>
+      </w:r>
+      <w:r>
+        <w:rPr>
+          <w:b/>
+        </w:rPr>
+        <w:t>Sariq (gelli) probirka</w:t>
+      </w:r>
+      <w:r>
+        <w:rPr>
+          <w:b w:val="0"/>
+        </w:rPr>
+        <w:t xml:space="preserve"> — gel to'siq zardobni qondan ajratib turadi, yo'lda aralashmaydi; ajratish shart emas.</w:t>
+      </w:r>
+    </w:p>
+    <w:p>
+      <w:pPr>
+        <w:spacing w:after="20"/>
+        <w:ind w:left="510" w:hanging="340"/>
+      </w:pPr>
+      <w:r>
+        <w:t xml:space="preserve">3.  </w:t>
+      </w:r>
+      <w:r>
+        <w:rPr>
+          <w:b w:val="0"/>
+        </w:rPr>
+        <w:t>Kelganda zardob qon bilan aralashgan bo'lsa — qayta sentrifugalanadi, lekin natijaga izoh yoziladi: "namuna aralashgan holda keldi"; kaliy va glyukoza natijasi berilmaydi, qayta olinadi.</w:t>
       </w:r>
     </w:p>
     <w:p>
@@ -5165,7 +5382,7 @@
         <w:pStyle w:val="Heading2"/>
       </w:pPr>
       <w:r>
-        <w:t>10. Takliflar va ochiq savollar</w:t>
+        <w:t>10. Takliflar</w:t>
       </w:r>
     </w:p>
     <w:p>
@@ -5173,7 +5390,7 @@
         <w:rPr>
           <w:b w:val="0"/>
         </w:rPr>
-        <w:t>Qo'llanmani yakunlash uchun quyidagilarni aniqlash va hal qilish kerak.</w:t>
+        <w:t>Qo'llanmani yakunlash uchun quyidagilarni hal qilish kerak.</w:t>
       </w:r>
     </w:p>
     <w:p>
@@ -5282,58 +5499,62 @@
     </w:p>
     <w:p>
       <w:pPr>
-        <w:pStyle w:val="Heading3"/>
+        <w:spacing w:after="20"/>
+        <w:ind w:left="340"/>
       </w:pPr>
       <w:r>
-        <w:t>Ochiq savollar</w:t>
+        <w:rPr>
+          <w:sz w:val="26"/>
+        </w:rPr>
+        <w:t xml:space="preserve">☐  </w:t>
+      </w:r>
+      <w:r>
+        <w:rPr>
+          <w:b/>
+        </w:rPr>
+        <w:t>Juft sinovni takrorlash.</w:t>
+      </w:r>
+      <w:r>
+        <w:rPr>
+          <w:b w:val="0"/>
+        </w:rPr>
+        <w:t xml:space="preserve"> Bitta bemordan binafsha va sariq probirka olinib, ikkalasi </w:t>
+      </w:r>
+      <w:r>
+        <w:rPr>
+          <w:b/>
+        </w:rPr>
+        <w:t>bir vaqtda, darhol</w:t>
+      </w:r>
+      <w:r>
+        <w:rPr>
+          <w:b w:val="0"/>
+        </w:rPr>
+        <w:t xml:space="preserve"> sentrifugalanadi. Glyukoza, mochevina, kreatinin, umumiy oqsil, xolesterin va triglitserid solishtiriladi. Farq 5% dan kam bo'lsa, 6-bo'limdagi ro'yxatga qo'shiladi.</w:t>
       </w:r>
     </w:p>
     <w:p>
       <w:pPr>
-        <w:pStyle w:val="ListBullet"/>
         <w:spacing w:after="20"/>
+        <w:ind w:left="340"/>
       </w:pPr>
+      <w:r>
+        <w:rPr>
+          <w:sz w:val="26"/>
+        </w:rPr>
+        <w:t xml:space="preserve">☐  </w:t>
+      </w:r>
+      <w:r>
+        <w:rPr>
+          <w:b/>
+        </w:rPr>
+        <w:t>Filial namunalari ependorfda.</w:t>
+      </w:r>
       <w:r>
         <w:rPr>
           <w:b w:val="0"/>
         </w:rPr>
-        <w:t>12.10 sinovida sariq probirka EDTA bilan bir vaqtda sentrifugalanganmi yoki oldinroq? Glyukoza sinovini takrorlash kerak: ikkala probirka darhol sentrifugalanadi. Shu sinovga mochevina, kreatinin, umumiy oqsil va lipidlarni ham qo'shish tavsiya etiladi.</w:t>
-      </w:r>
-    </w:p>
-    <w:p>
-      <w:pPr>
-        <w:pStyle w:val="ListBullet"/>
-        <w:spacing w:after="20"/>
-      </w:pPr>
-      <w:r>
-        <w:rPr>
-          <w:b w:val="0"/>
-        </w:rPr>
-        <w:t>EDTA li 1.5 ml ependorf qancha hajmgacha to'ldiriladi (ishlab chiqaruvchi ko'rsatgan belgi)?</w:t>
-      </w:r>
-    </w:p>
-    <w:p>
-      <w:pPr>
-        <w:pStyle w:val="ListBullet"/>
-        <w:spacing w:after="20"/>
-      </w:pPr>
-      <w:r>
-        <w:rPr>
-          <w:b w:val="0"/>
-        </w:rPr>
-        <w:t>EChT (SOE) qilinadimi? Qilinsa, qaysi usulda va qaysi probirkada (Panchenkov — alohida 5% sitrat bilan)?</w:t>
-      </w:r>
-    </w:p>
-    <w:p>
-      <w:pPr>
-        <w:pStyle w:val="ListBullet"/>
-        <w:spacing w:after="20"/>
-      </w:pPr>
-      <w:r>
-        <w:rPr>
-          <w:b w:val="0"/>
-        </w:rPr>
-        <w:t>Filialdan keladigan namunalar qanday yetkaziladi: to'liq qonmi yoki ajratilgan zardobmi? Yetkazish vaqti 8-bo'lim muddatlariga sig'adimi?</w:t>
+        <w:t xml:space="preserve"> Qizil probirka va EDTA plazmasi filialda ependorfga ajratib yuborilsin (7-bo'lim); yo'lda aralashgan namunadan K va glyukoza berilmasin.</w:t>
       </w:r>
     </w:p>
     <w:sectPr>

</xml_diff>

<commit_message>
Qon olish qo'llanmasi: kaliy va minerallar faqat sariq gelli probirkaga
Co-Authored-By: Claude Opus 5.5 <noreply@anthropic.com>
</commit_message>
<xml_diff>
--- a/docs/qollanmalar/qon_olish_qollanma.docx
+++ b/docs/qollanmalar/qon_olish_qollanma.docx
@@ -39,7 +39,7 @@
         <w:rPr>
           <w:b/>
         </w:rPr>
-        <w:t>qon hujayralari va HbA1c — binafsha (EDTA); minerallar, gormonlar, IFA va ko'pchilik bioximiya — sariq yoki qizil (zardob); koagulogramma — faqat ko'k (sitrat).</w:t>
+        <w:t>qon hujayralari va HbA1c — binafsha (EDTA); kaliy va boshqa minerallar — sariq gelli; gormonlar, IFA va ko'pchilik bioximiya — sariq yoki qizil (zardob); koagulogramma — faqat ko'k (sitrat).</w:t>
       </w:r>
     </w:p>
     <w:tbl>
@@ -381,7 +381,7 @@
                 <w:b w:val="0"/>
                 <w:sz w:val="20"/>
               </w:rPr>
-              <w:t>Sariq (gel) yoki qizil</w:t>
+              <w:t>Sariq (gelli)</w:t>
             </w:r>
           </w:p>
         </w:tc>
@@ -398,7 +398,7 @@
                 <w:b w:val="0"/>
                 <w:sz w:val="20"/>
               </w:rPr>
-              <w:t>EDTA plazmasi YAROQSIZ (6-bo'lim)</w:t>
+              <w:t>EDTA plazmasi YAROQSIZ (6-bo'lim); gel sentrifugadan keyin K ni hujayradan ajratib turadi</w:t>
             </w:r>
           </w:p>
         </w:tc>
@@ -656,7 +656,7 @@
         <w:rPr>
           <w:b w:val="0"/>
         </w:rPr>
-        <w:t>: sariq (yoki qizil) + binafsha.</w:t>
+        <w:t>: sariq gelli + binafsha.</w:t>
       </w:r>
     </w:p>
     <w:p>
@@ -1098,7 +1098,7 @@
                 <w:b w:val="0"/>
                 <w:sz w:val="20"/>
               </w:rPr>
-              <w:t>Zardob: bioximiya (ayniqsa minerallar), IFA</w:t>
+              <w:t>Zardob: K va boshqa minerallar (asosiy probirka), bioximiya, IFA</w:t>
             </w:r>
           </w:p>
         </w:tc>
@@ -2798,7 +2798,7 @@
         <w:rPr>
           <w:b/>
         </w:rPr>
-        <w:t>alohida sariq (yoki qizil) probirka shart</w:t>
+        <w:t>alohida probirka shart: minerallar uchun sariq gelli, ALP va amilaza uchun sariq yoki qizil</w:t>
       </w:r>
       <w:r>
         <w:rPr>
@@ -3924,7 +3924,7 @@
         <w:rPr>
           <w:b w:val="0"/>
         </w:rPr>
-        <w:t xml:space="preserve"> — gel to'siq zardobni qondan ajratib turadi, yo'lda aralashmaydi; ajratish shart emas.</w:t>
+        <w:t xml:space="preserve"> — gel to'siq zardobni qondan ajratib turadi, yo'lda aralashmaydi; ajratish shart emas. Kaliy va minerallar shu sababli doim sariq gelli probirkaga olinadi.</w:t>
       </w:r>
     </w:p>
     <w:p>

</xml_diff>